<commit_message>
dimensional modelling for the dataco_supplychain data
</commit_message>
<xml_diff>
--- a/dataco_supplychain/dataco_sc_documentation/cleaning_report_dataco.docx
+++ b/dataco_supplychain/dataco_sc_documentation/cleaning_report_dataco.docx
@@ -104,43 +104,15 @@
           <w:sz w:val="22"/>
           <w:szCs w:val="22"/>
         </w:rPr>
-        <w:t xml:space="preserve"> column has values with symbols inside the </w:t>
-      </w:r>
-      <w:proofErr w:type="gramStart"/>
-      <w:r>
-        <w:rPr>
-          <w:rFonts w:ascii="Ink Journal" w:hAnsi="Ink Journal"/>
-          <w:sz w:val="22"/>
-          <w:szCs w:val="22"/>
-        </w:rPr>
-        <w:t>word.</w:t>
-      </w:r>
-      <w:r>
-        <w:rPr>
-          <w:rFonts w:ascii="Ink Journal" w:hAnsi="Ink Journal"/>
-          <w:sz w:val="22"/>
-          <w:szCs w:val="22"/>
-        </w:rPr>
-        <w:t>(</w:t>
-      </w:r>
-      <w:proofErr w:type="spellStart"/>
-      <w:proofErr w:type="gramEnd"/>
-      <w:r>
-        <w:rPr>
-          <w:rFonts w:ascii="Ink Journal" w:hAnsi="Ink Journal"/>
-          <w:sz w:val="22"/>
-          <w:szCs w:val="22"/>
-        </w:rPr>
-        <w:t>egs</w:t>
-      </w:r>
-      <w:proofErr w:type="spellEnd"/>
-      <w:r>
-        <w:rPr>
-          <w:rFonts w:ascii="Ink Journal" w:hAnsi="Ink Journal"/>
-          <w:sz w:val="22"/>
-          <w:szCs w:val="22"/>
-        </w:rPr>
-        <w:t xml:space="preserve"> </w:t>
+        <w:t xml:space="preserve"> column has values with symbols inside the word.</w:t>
+      </w:r>
+      <w:r>
+        <w:rPr>
+          <w:rFonts w:ascii="Ink Journal" w:hAnsi="Ink Journal"/>
+          <w:sz w:val="22"/>
+          <w:szCs w:val="22"/>
+        </w:rPr>
+        <w:t xml:space="preserve">(egs </w:t>
       </w:r>
       <w:r>
         <w:rPr>
@@ -209,44 +181,16 @@
           <w:sz w:val="22"/>
           <w:szCs w:val="22"/>
         </w:rPr>
-        <w:t xml:space="preserve">Removed the </w:t>
-      </w:r>
-      <w:proofErr w:type="spellStart"/>
-      <w:r>
-        <w:rPr>
-          <w:rFonts w:ascii="Ink Journal" w:hAnsi="Ink Journal"/>
-          <w:sz w:val="22"/>
-          <w:szCs w:val="22"/>
-        </w:rPr>
-        <w:t>customer_password</w:t>
-      </w:r>
-      <w:proofErr w:type="spellEnd"/>
-      <w:r>
-        <w:rPr>
-          <w:rFonts w:ascii="Ink Journal" w:hAnsi="Ink Journal"/>
-          <w:sz w:val="22"/>
-          <w:szCs w:val="22"/>
-        </w:rPr>
-        <w:t xml:space="preserve"> and product image</w:t>
-      </w:r>
-      <w:r>
-        <w:rPr>
-          <w:rFonts w:ascii="Ink Journal" w:hAnsi="Ink Journal"/>
-          <w:sz w:val="22"/>
-          <w:szCs w:val="22"/>
-        </w:rPr>
-        <w:t xml:space="preserve">, </w:t>
-      </w:r>
-      <w:proofErr w:type="spellStart"/>
-      <w:r>
-        <w:rPr>
-          <w:rFonts w:ascii="Ink Journal" w:hAnsi="Ink Journal"/>
-          <w:sz w:val="22"/>
-          <w:szCs w:val="22"/>
-        </w:rPr>
-        <w:t>customer_email</w:t>
-      </w:r>
-      <w:proofErr w:type="spellEnd"/>
+        <w:t>Removed the customer_password and product image</w:t>
+      </w:r>
+      <w:r>
+        <w:rPr>
+          <w:rFonts w:ascii="Ink Journal" w:hAnsi="Ink Journal"/>
+          <w:sz w:val="22"/>
+          <w:szCs w:val="22"/>
+        </w:rPr>
+        <w:t>, customer_email</w:t>
+      </w:r>
       <w:r>
         <w:rPr>
           <w:rFonts w:ascii="Ink Journal" w:hAnsi="Ink Journal"/>
@@ -275,62 +219,103 @@
           <w:sz w:val="22"/>
           <w:szCs w:val="22"/>
         </w:rPr>
-        <w:t xml:space="preserve">Create a </w:t>
-      </w:r>
-      <w:proofErr w:type="spellStart"/>
-      <w:r>
-        <w:rPr>
-          <w:rFonts w:ascii="Ink Journal" w:hAnsi="Ink Journal"/>
-          <w:sz w:val="22"/>
-          <w:szCs w:val="22"/>
-        </w:rPr>
-        <w:t>dq_notes</w:t>
-      </w:r>
-      <w:proofErr w:type="spellEnd"/>
-      <w:r>
-        <w:rPr>
-          <w:rFonts w:ascii="Ink Journal" w:hAnsi="Ink Journal"/>
-          <w:sz w:val="22"/>
-          <w:szCs w:val="22"/>
-        </w:rPr>
-        <w:t xml:space="preserve"> column that records the instances of the above issues and bad </w:t>
-      </w:r>
-      <w:proofErr w:type="spellStart"/>
-      <w:r>
-        <w:rPr>
-          <w:rFonts w:ascii="Ink Journal" w:hAnsi="Ink Journal"/>
-          <w:sz w:val="22"/>
-          <w:szCs w:val="22"/>
-        </w:rPr>
-        <w:t>order_id</w:t>
-      </w:r>
-      <w:proofErr w:type="spellEnd"/>
-      <w:r>
-        <w:rPr>
-          <w:rFonts w:ascii="Ink Journal" w:hAnsi="Ink Journal"/>
-          <w:sz w:val="22"/>
-          <w:szCs w:val="22"/>
-        </w:rPr>
-        <w:t xml:space="preserve"> and </w:t>
-      </w:r>
-      <w:proofErr w:type="spellStart"/>
-      <w:r>
-        <w:rPr>
-          <w:rFonts w:ascii="Ink Journal" w:hAnsi="Ink Journal"/>
-          <w:sz w:val="22"/>
-          <w:szCs w:val="22"/>
-        </w:rPr>
-        <w:t>order_item_id</w:t>
-      </w:r>
-      <w:proofErr w:type="spellEnd"/>
-      <w:r>
-        <w:rPr>
-          <w:rFonts w:ascii="Ink Journal" w:hAnsi="Ink Journal"/>
-          <w:sz w:val="22"/>
-          <w:szCs w:val="22"/>
-        </w:rPr>
-        <w:t>.</w:t>
-      </w:r>
+        <w:t>Create a dq_notes column that records the instances of the above issues and bad order_id and order_item_id.</w:t>
+      </w:r>
+    </w:p>
+    <w:p>
+      <w:pPr>
+        <w:pStyle w:val="Heading1"/>
+        <w:rPr>
+          <w:rFonts w:ascii="Ink Journal" w:hAnsi="Ink Journal"/>
+          <w:color w:val="47D459" w:themeColor="accent3" w:themeTint="99"/>
+          <w:sz w:val="22"/>
+          <w:szCs w:val="22"/>
+        </w:rPr>
+      </w:pPr>
+      <w:r>
+        <w:rPr>
+          <w:rFonts w:ascii="Ink Journal" w:hAnsi="Ink Journal"/>
+          <w:color w:val="47D459" w:themeColor="accent3" w:themeTint="99"/>
+          <w:sz w:val="22"/>
+          <w:szCs w:val="22"/>
+        </w:rPr>
+        <w:t>Issues identified in the staging schema.</w:t>
+      </w:r>
+    </w:p>
+    <w:p>
+      <w:pPr>
+        <w:pStyle w:val="ListParagraph"/>
+        <w:numPr>
+          <w:ilvl w:val="0"/>
+          <w:numId w:val="5"/>
+        </w:numPr>
+      </w:pPr>
+      <w:r>
+        <w:rPr>
+          <w:rFonts w:ascii="Ink Journal" w:hAnsi="Ink Journal"/>
+          <w:sz w:val="22"/>
+          <w:szCs w:val="22"/>
+        </w:rPr>
+        <w:t xml:space="preserve">Order_country column had mojibake characters, </w:t>
+      </w:r>
+      <w:r>
+        <w:rPr>
+          <w:rFonts w:ascii="Ink Journal" w:hAnsi="Ink Journal"/>
+          <w:sz w:val="22"/>
+          <w:szCs w:val="22"/>
+        </w:rPr>
+        <w:t xml:space="preserve">in </w:t>
+      </w:r>
+      <w:r>
+        <w:rPr>
+          <w:rFonts w:ascii="Ink Journal" w:hAnsi="Ink Journal"/>
+          <w:sz w:val="22"/>
+          <w:szCs w:val="22"/>
+        </w:rPr>
+        <w:t xml:space="preserve">the </w:t>
+      </w:r>
+      <w:r>
+        <w:rPr>
+          <w:rFonts w:ascii="Ink Journal" w:hAnsi="Ink Journal"/>
+          <w:sz w:val="22"/>
+          <w:szCs w:val="22"/>
+        </w:rPr>
+        <w:t xml:space="preserve">staging schema, the loading </w:t>
+      </w:r>
+      <w:r>
+        <w:rPr>
+          <w:rFonts w:ascii="Ink Journal" w:hAnsi="Ink Journal"/>
+          <w:sz w:val="22"/>
+          <w:szCs w:val="22"/>
+        </w:rPr>
+        <w:t>script was edited to correct thi</w:t>
+      </w:r>
+      <w:r>
+        <w:rPr>
+          <w:rFonts w:ascii="Ink Journal" w:hAnsi="Ink Journal"/>
+          <w:sz w:val="22"/>
+          <w:szCs w:val="22"/>
+        </w:rPr>
+        <w:t>s.</w:t>
+      </w:r>
+    </w:p>
+    <w:p>
+      <w:pPr>
+        <w:pStyle w:val="ListParagraph"/>
+        <w:numPr>
+          <w:ilvl w:val="0"/>
+          <w:numId w:val="5"/>
+        </w:numPr>
+      </w:pPr>
+    </w:p>
+    <w:p>
+      <w:pPr>
+        <w:rPr>
+          <w:rFonts w:ascii="Ink Journal" w:hAnsi="Ink Journal"/>
+          <w:sz w:val="22"/>
+          <w:szCs w:val="22"/>
+        </w:rPr>
+      </w:pPr>
     </w:p>
     <w:sectPr>
       <w:pgSz w:w="12240" w:h="15840"/>
@@ -544,6 +529,92 @@
     </w:lvl>
   </w:abstractNum>
   <w:abstractNum w:abstractNumId="2" w15:restartNumberingAfterBreak="0">
+    <w:nsid w:val="22196405"/>
+    <w:multiLevelType w:val="hybridMultilevel"/>
+    <w:tmpl w:val="B63A703A"/>
+    <w:lvl w:ilvl="0" w:tplc="1009000F">
+      <w:start w:val="1"/>
+      <w:numFmt w:val="decimal"/>
+      <w:lvlText w:val="%1."/>
+      <w:lvlJc w:val="left"/>
+      <w:pPr>
+        <w:ind w:left="720" w:hanging="360"/>
+      </w:pPr>
+    </w:lvl>
+    <w:lvl w:ilvl="1" w:tplc="10090019" w:tentative="1">
+      <w:start w:val="1"/>
+      <w:numFmt w:val="lowerLetter"/>
+      <w:lvlText w:val="%2."/>
+      <w:lvlJc w:val="left"/>
+      <w:pPr>
+        <w:ind w:left="1440" w:hanging="360"/>
+      </w:pPr>
+    </w:lvl>
+    <w:lvl w:ilvl="2" w:tplc="1009001B" w:tentative="1">
+      <w:start w:val="1"/>
+      <w:numFmt w:val="lowerRoman"/>
+      <w:lvlText w:val="%3."/>
+      <w:lvlJc w:val="right"/>
+      <w:pPr>
+        <w:ind w:left="2160" w:hanging="180"/>
+      </w:pPr>
+    </w:lvl>
+    <w:lvl w:ilvl="3" w:tplc="1009000F" w:tentative="1">
+      <w:start w:val="1"/>
+      <w:numFmt w:val="decimal"/>
+      <w:lvlText w:val="%4."/>
+      <w:lvlJc w:val="left"/>
+      <w:pPr>
+        <w:ind w:left="2880" w:hanging="360"/>
+      </w:pPr>
+    </w:lvl>
+    <w:lvl w:ilvl="4" w:tplc="10090019" w:tentative="1">
+      <w:start w:val="1"/>
+      <w:numFmt w:val="lowerLetter"/>
+      <w:lvlText w:val="%5."/>
+      <w:lvlJc w:val="left"/>
+      <w:pPr>
+        <w:ind w:left="3600" w:hanging="360"/>
+      </w:pPr>
+    </w:lvl>
+    <w:lvl w:ilvl="5" w:tplc="1009001B" w:tentative="1">
+      <w:start w:val="1"/>
+      <w:numFmt w:val="lowerRoman"/>
+      <w:lvlText w:val="%6."/>
+      <w:lvlJc w:val="right"/>
+      <w:pPr>
+        <w:ind w:left="4320" w:hanging="180"/>
+      </w:pPr>
+    </w:lvl>
+    <w:lvl w:ilvl="6" w:tplc="1009000F" w:tentative="1">
+      <w:start w:val="1"/>
+      <w:numFmt w:val="decimal"/>
+      <w:lvlText w:val="%7."/>
+      <w:lvlJc w:val="left"/>
+      <w:pPr>
+        <w:ind w:left="5040" w:hanging="360"/>
+      </w:pPr>
+    </w:lvl>
+    <w:lvl w:ilvl="7" w:tplc="10090019" w:tentative="1">
+      <w:start w:val="1"/>
+      <w:numFmt w:val="lowerLetter"/>
+      <w:lvlText w:val="%8."/>
+      <w:lvlJc w:val="left"/>
+      <w:pPr>
+        <w:ind w:left="5760" w:hanging="360"/>
+      </w:pPr>
+    </w:lvl>
+    <w:lvl w:ilvl="8" w:tplc="1009001B" w:tentative="1">
+      <w:start w:val="1"/>
+      <w:numFmt w:val="lowerRoman"/>
+      <w:lvlText w:val="%9."/>
+      <w:lvlJc w:val="right"/>
+      <w:pPr>
+        <w:ind w:left="6480" w:hanging="180"/>
+      </w:pPr>
+    </w:lvl>
+  </w:abstractNum>
+  <w:abstractNum w:abstractNumId="3" w15:restartNumberingAfterBreak="0">
     <w:nsid w:val="43BA0C23"/>
     <w:multiLevelType w:val="hybridMultilevel"/>
     <w:tmpl w:val="BBE84136"/>
@@ -629,7 +700,7 @@
       </w:pPr>
     </w:lvl>
   </w:abstractNum>
-  <w:abstractNum w:abstractNumId="3" w15:restartNumberingAfterBreak="0">
+  <w:abstractNum w:abstractNumId="4" w15:restartNumberingAfterBreak="0">
     <w:nsid w:val="4612603A"/>
     <w:multiLevelType w:val="hybridMultilevel"/>
     <w:tmpl w:val="AFAE3EF4"/>
@@ -719,12 +790,15 @@
     <w:abstractNumId w:val="1"/>
   </w:num>
   <w:num w:numId="2" w16cid:durableId="460003173">
-    <w:abstractNumId w:val="3"/>
+    <w:abstractNumId w:val="4"/>
   </w:num>
   <w:num w:numId="3" w16cid:durableId="482820997">
     <w:abstractNumId w:val="0"/>
   </w:num>
   <w:num w:numId="4" w16cid:durableId="209266781">
+    <w:abstractNumId w:val="3"/>
+  </w:num>
+  <w:num w:numId="5" w16cid:durableId="1329282642">
     <w:abstractNumId w:val="2"/>
   </w:num>
 </w:numbering>
@@ -1333,6 +1407,7 @@
   <w:style w:type="character" w:default="1" w:styleId="DefaultParagraphFont">
     <w:name w:val="Default Paragraph Font"/>
     <w:uiPriority w:val="1"/>
+    <w:semiHidden/>
     <w:unhideWhenUsed/>
   </w:style>
   <w:style w:type="table" w:default="1" w:styleId="TableNormal">

</xml_diff>